<commit_message>
Update HTSA paper: merge MD intro, apply grammar fixes to Piter sections; update build scripts and assets
</commit_message>
<xml_diff>
--- a/mouse_new/paper/HTSA_Paper.docx
+++ b/mouse_new/paper/HTSA_Paper.docx
@@ -251,7 +251,7 @@
     <w:p>
       <w:pPr>
         <w:spacing w:line="480" w:lineRule="auto" w:after="120"/>
-        <w:shd w:fill="B6D7A8"/>
+        <w:shd w:fill="F4CCCC"/>
       </w:pPr>
       <w:r>
         <w:rPr>
@@ -259,49 +259,7 @@
           <w:b w:val="0"/>
           <w:sz w:val="24"/>
         </w:rPr>
-        <w:t>The published study behind this dataset examines how injured dorsal root ganglion (DRG) neurons balance stress adaptation with regenerative growth after sciatic nerve injury, with particular emphasis on the aryl hydrocarbon receptor (AhR) as a regulator of that balance (Halawani et al., 2023). Because DRG neurons retain peripheral regenerative capacity, they provide a useful model for studying how injury-responsive transcriptional programs shift between preservation and growth after nerve damage (Halawani et al., 2023).</w:t>
-      </w:r>
-    </w:p>
-    <w:p>
-      <w:pPr>
-        <w:spacing w:line="480" w:lineRule="auto" w:after="120"/>
-        <w:shd w:fill="B6D7A8"/>
-      </w:pPr>
-      <w:r>
-        <w:rPr>
-          <w:rFonts w:ascii="Times New Roman" w:hAnsi="Times New Roman"/>
-          <w:b w:val="0"/>
-          <w:sz w:val="24"/>
-        </w:rPr>
-        <w:t>The source paper frames AhR as a neuronal brake on axon regeneration rather than as a direct promoter of growth. In that study, AhR-associated signaling remained distinct from the better-known pro-regenerative transcription factor network and was instead linked to stress response, translation control, and proteostasis-related regulation (Halawani et al., 2023). This context makes the RNA-seq dataset valuable for reanalysis because it allows the injury response to be examined at a transcriptome-wide level instead of only through a short list of candidate genes.</w:t>
-      </w:r>
-    </w:p>
-    <w:p>
-      <w:pPr>
-        <w:spacing w:line="480" w:lineRule="auto" w:after="120"/>
-        <w:shd w:fill="B6D7A8"/>
-      </w:pPr>
-      <w:r>
-        <w:rPr>
-          <w:rFonts w:ascii="Times New Roman" w:hAnsi="Times New Roman"/>
-          <w:b w:val="0"/>
-          <w:sz w:val="24"/>
-        </w:rPr>
-        <w:t>The experimental design compared ipsilateral DRGs from the injured side with contralateral DRGs from the uninjured side while also tracking genotype. The study used a neuron-focused conditional knockout of Ahr, which is important because it isolates neuron-intrinsic effects more cleanly than a full-body knockout background with broader pathology (Halawani et al., 2023). In the subset reanalyzed here, the two genotype classes correspond to wild-type control ff samples and AhR conditional knockout cre samples drawn from the same 20-sample DRG cohort (Halawani et al., 2023; NCBI SRA, 2026; NCBI BioProject, 2026; NCBI GEO, 2026).</w:t>
-      </w:r>
-    </w:p>
-    <w:p>
-      <w:pPr>
-        <w:spacing w:line="480" w:lineRule="auto" w:after="120"/>
-        <w:shd w:fill="B6D7A8"/>
-      </w:pPr>
-      <w:r>
-        <w:rPr>
-          <w:rFonts w:ascii="Times New Roman" w:hAnsi="Times New Roman"/>
-          <w:b w:val="0"/>
-          <w:sz w:val="24"/>
-        </w:rPr>
-        <w:t>We used the original paper as a biological anchor while extending the analysis beyond its candidate-gene emphasis. Instead of limiting interpretation to the genes highlighted in the source study, we used transcriptome-wide differential expression, reproducible bend-point narrowing, and pathway-level analysis to test whether the strongest signals in the data still centered on injury-side differences and to determine how genotype-related effects compared with that dominant contrast.</w:t>
+        <w:t>We reanalyze a published mouse dorsal root ganglion (DRG) RNA-seq dataset to examine how injury responses and regeneration are balanced after peripheral nerve damage, with particular attention to the aryl hydrocarbon receptor (Ahr) (Halawani et al., 2023; NCBI SRA, 2026; NCBI BioProject, 2026; NCBI GEO, 2026). The original study used a neuronal conditional Ahr knockout because DRGs are a useful model for peripheral axon regrowth after sciatic nerve injury, and the conditional design helps isolate neuron-intrinsic effects more cleanly than a constitutive knockout background (Halawani et al., 2023). In this dataset, the primary biological comparison contrasts ipsilateral DRG tissue from the injured side with contralateral DRG tissue from the uninjured side; genotype provides a secondary layer of comparison between wild-type control (ff) animals and the Ahr conditional knockout (cre) background (Halawani et al., 2023; NCBI SRA, 2026; NCBI BioProject, 2026; NCBI GEO, 2026). We use the original paper as a mechanistic anchor but extend its candidate-gene emphasis by applying transcriptome-wide differential expression and pathway-level follow-up to the full dataset. This approach allows us to test whether the strongest signals remain centered on injury-side differences, to quantify how strongly genotype contributes relative to that main contrast, and to connect the resulting gene sets to broader biological processes such as signaling, stress response, and regeneration-related remodeling. This emphasis is consistent with the source paper's transcriptomic framing, in which injury status explained more of the global structure than genotype alone (Halawani et al., 2023).</w:t>
       </w:r>
     </w:p>
     <w:p>
@@ -348,7 +306,7 @@
           <w:b w:val="0"/>
           <w:sz w:val="24"/>
         </w:rPr>
-        <w:t>This project reanalyzed mouse DRG bulk RNA-seq data collected after sciatic nerve injury using a four-stage computational workflow: Data Collection, Data Cleaning, Data Preparation, and Data Analysis and Interpretation. This structure preserved accession tracking, quality control, alignment review, and downstream modeling as explicit and reproducible checkpoints while allowing the same analysis path to be reused after earlier dataset-selection issues (Wirth &amp; Hipp, 2000).</w:t>
+        <w:t>This project reanalyzed mouse DRG bulk RNA-seq data collected after sciatic nerve injury using a four-stage computational workflow: Data Collection, Data Cleaning, Data Preparation, and Data Analysis and Interpretation. This structure preserved accession tracking, quality control, alignment review, and downstream modeling as explicit, reproducible checkpoints while allowing the same analysis path to be reused after earlier dataset-selection issues (Wirth &amp; Hipp, 2000).</w:t>
       </w:r>
     </w:p>
     <w:p>
@@ -362,7 +320,7 @@
           <w:b w:val="0"/>
           <w:sz w:val="24"/>
         </w:rPr>
-        <w:t>The working subset comprised 20 Illumina NovaSeq X paired-end libraries from SRP618841 (BioProject PRJNA1322439; GEO GSE243308), representing L4--L6 DRG samples collected 1 day after sciatic nerve injury (Halawani et al., 2023; NCBI SRA, 2026; NCBI BioProject, 2026; NCBI GEO, 2026). The retained subset was organized as a balanced side-by-genotype design within the family_drg_novaseqx family, with equal representation of ipsilateral and contralateral samples and of wild-type and cKO genotype classes before quality control, alignment, and differential expression analysis.</w:t>
+        <w:t>The working subset consisted of 20 Illumina NovaSeq X paired-end libraries from SRP618841 (BioProject PRJNA1322439; GEO GSE243308), representing L4--L6 DRG samples collected one day after sciatic nerve injury (Halawani et al., 2023; NCBI SRA, 2026; NCBI BioProject, 2026; NCBI GEO, 2026). The retained subset was organized as a balanced side-by-genotype design within the family_drg_novaseqx family, with equal representation of ipsilateral and contralateral samples and of wild-type and cKO genotype classes before quality control, alignment, and differential expression analysis.</w:t>
       </w:r>
     </w:p>
     <w:p>
@@ -437,7 +395,7 @@
           <w:b w:val="0"/>
           <w:sz w:val="24"/>
         </w:rPr>
-        <w:t>The workflow was structured as four connected stages with explicit checkpoints and handoffs. The Collection stage used prefetch and fasterq-dump to assemble the sample table and family manifest, retaining 20 SRRs across four balanced subgroups (n = 5 each). The Cleaning stage applied FastQC, MultiQC, and fastp, generating the QC summaries that documented adapter remediation before alignment. The Preparation stage used STAR with GeneCounts to produce coordinate-sorted BAM files, STAR alignment summaries, and per-sample count tables. The Analysis stage used DESeq2, bend-point follow-up, and g:Profiler to generate the differential expression and enrichment outputs used in later interpretation (Andrews, 2010; Ewels et al., 2016; Chen et al., 2018; Dobin et al., 2013; Love et al., 2014; Kolberg et al., 2020).</w:t>
+        <w:t>The workflow was structured into four connected stages, each with explicit checkpoints and handoffs. The Collection stage used prefetch and fasterq-dump to assemble the sample table and family manifest, retaining 20 SRRs across four balanced subgroups (n = 5 each). The Cleaning stage applied FastQC, MultiQC, and fastp, generating the QC summaries that documented adapter remediation before alignment. The Preparation stage used STAR with GeneCounts to produce coordinate-sorted BAM files, STAR alignment summaries, and per-sample count tables. The Analysis stage used DESeq2, bend-point follow-up, and g:Profiler to generate the differential expression and enrichment outputs used in later interpretation (Andrews, 2010; Ewels et al., 2016; Chen et al., 2018; Dobin et al., 2013; Love et al., 2014; Kolberg et al., 2020).</w:t>
       </w:r>
     </w:p>
     <w:p>
@@ -1063,7 +1021,7 @@
           <w:b w:val="0"/>
           <w:sz w:val="24"/>
         </w:rPr>
-        <w:t>Data Collection: SRA acquisition and sample organization. Public runs were retrieved with project wrappers around prefetch and fasterq-dump, and the local workflow retained 20 paired-end NovaSeq X libraries from the 1-day-post-injury DRG subset. After download, metadata were consolidated into a design-aware sample table with side_class (ipsilateral or contralateral), geno_class (WT or cKO), and derived condition-family labels. This preserved a balanced 2 2 design and created a reusable manifest for downstream notebooks (NCBI, 2026; NCBI SRA, 2026; NCBI BioProject, 2026; NCBI GEO, 2026).</w:t>
+        <w:t>Data Collection: SRA acquisition and sample organization. Public runs were retrieved using project wrappers around prefetch and fasterq-dump, and the local workflow retained 20 paired-end NovaSeq X libraries from the one-day post-injury DRG subset. After download, metadata were consolidated into a design-aware sample table with side_class (ipsilateral or contralateral), geno_class (WT or cKO), and derived condition-family labels. This preserved a balanced 2 2 design and created a reusable manifest for downstream notebooks (NCBI, 2026; NCBI SRA, 2026; NCBI BioProject, 2026; NCBI GEO, 2026).</w:t>
       </w:r>
     </w:p>
     <w:p>
@@ -1077,7 +1035,7 @@
           <w:b w:val="0"/>
           <w:sz w:val="24"/>
         </w:rPr>
-        <w:t>Data Cleaning: quality control and read trimming. Raw read quality was evaluated with FastQC, and cohort-level summaries were consolidated with MultiQC (Andrews, 2010; Ewels et al., 2016). The local workflow used fastp v0.23.2 as the canonical cleanup tool because it provided a reproducible paired-end workflow, generated per-sample reports, and reduced adapter-related signal more effectively than the earlier baseline (Chen et al., 2018). The retained configuration used paired-end adapter detection, poly-G trimming, a mean-quality cutoff of 20, a minimum retained length of 30 bases, and per-sample HTML/JSON reporting.</w:t>
+        <w:t>Data Cleaning: quality control and read trimming. Raw read quality was evaluated with FastQC, and cohort-level summaries were consolidated with MultiQC (Andrews, 2010; Ewels et al., 2016). The local workflow used fastp v0.23.2 as the canonical cleanup tool because it provided a reproducible paired-end workflow, generated per-sample reports, and reduced adapter-related signal more effectively than the earlier baseline (Chen et al., 2018). The retained configuration used paired-end adapter detection, poly-G trimming, a mean quality cutoff of 20, a minimum retained length of 30 bases, and per-sample HTML and JSON reporting.</w:t>
       </w:r>
     </w:p>
     <w:p>
@@ -1091,7 +1049,7 @@
           <w:b w:val="0"/>
           <w:sz w:val="24"/>
         </w:rPr>
-        <w:t>Data Preparation: reference selection and alignment. Trimmed read pairs were aligned to the Mus musculus GRCm39 primary assembly with the matching Ensembl release 115 annotation (Ensembl, 2025). The reference pair used in the local workflow consisted of Mus_musculus.GRCm39.dna.primary_assembly.fa and Mus_musculus.GRCm39.115.gtf. A STAR genome index was generated with sjdbOverhang = 150 to match the 151-bp paired-end reads, and alignment was performed with gzip-aware input handling, coordinate-sorted BAM output, and GeneCounts (Dobin et al., 2013).</w:t>
+        <w:t>Data Preparation: reference selection and alignment. Trimmed read pairs were aligned to the Mus musculus GRCm39 primary assembly with the matching Ensembl release 115 annotation (Ensembl, 2025). The reference pair used in the local workflow consisted of Mus_musculus.GRCm39.dna.primary_assembly.fa and Mus_musculus.GRCm39.115.gtf. A STAR genome index was generated with sjdbOverhang = 150 to match the 151-bp paired-end reads. Alignment was performed with gzip-aware input handling, coordinate-sorted BAM output, and GeneCounts (Dobin et al., 2013).</w:t>
       </w:r>
     </w:p>
     <w:p>
@@ -1105,7 +1063,7 @@
           <w:b w:val="0"/>
           <w:sz w:val="24"/>
         </w:rPr>
-        <w:t>Data Analysis and Interpretation: differential expression and functional analysis. The merged family count matrix was analyzed with DESeq2 using an interaction design formula (~ side_class * geno_class) so the effect of side could differ by genotype while all five contrast branches were extracted from a single fitted model (Love et al., 2014). Low-support genes were filtered before modeling, reducing the tested set from 78,334 to 21,481 genes while retaining all 20 DRG samples. Five contrasts were then evaluated: ipsilateral vs contralateral in WT, ipsilateral vs contralateral in cKO, WT vs cKO in contralateral, WT vs cKO in ipsilateral, and interaction.</w:t>
+        <w:t>Data Analysis and Interpretation: differential expression and functional analysis. The merged family count matrix was analyzed with DESeq2 using an interaction design formula (~ side_class * geno_class), so that the effect of side could differ by genotype; all five contrast branches were extracted from a single fitted model (Love et al., 2014). Low-support genes were filtered before modeling, reducing the tested set from 78,334 to 21,481 genes while retaining all 20 DRG samples. Five contrasts were then evaluated: ipsilateral vs contralateral in WT, ipsilateral vs contralateral in cKO, WT vs cKO in contralateral, WT vs cKO in ipsilateral, and the interaction term.</w:t>
       </w:r>
     </w:p>
     <w:p>
@@ -1119,7 +1077,7 @@
           <w:b w:val="0"/>
           <w:sz w:val="24"/>
         </w:rPr>
-        <w:t>Downstream interpretation followed a PCA-first, branch-priority logic. PCA was used to evaluate sample structure before long differential expression tables were emphasized, and the side-specific branches were then carried forward as the primary follow-up path. To avoid reducing very large DE outputs to unstructured gene lists, the workflow applied a bend-point rule to the ordered adjusted-p-value curve for each contrast. The resulting follow-up sets were then submitted to g:Profiler using GO Biological Process, KEGG, and Reactome layers (Kolberg et al., 2020; Gene Ontology Consortium, 2021; Kanehisa et al., 2025; Gillespie et al., 2022).</w:t>
+        <w:t>Downstream interpretation followed a PCA-first, branch-priority logic. PCA was used to evaluate sample structure before emphasizing long differential-expression tables, and the side-specific branches were then carried forward as the primary follow-up path. To avoid reducing very large DE outputs to unstructured gene lists, the workflow applied a bend-point rule to the ordered adjusted-p-value curve for each contrast. The resulting follow-up sets were then submitted to g:Profiler using GO Biological Process, KEGG, and Reactome layers (Kolberg et al., 2020; Gene Ontology Consortium, 2021; Kanehisa et al., 2025; Gillespie et al., 2022).</w:t>
       </w:r>
     </w:p>
     <w:p>
@@ -1393,7 +1351,7 @@
           <w:b w:val="0"/>
           <w:sz w:val="24"/>
         </w:rPr>
-        <w:t>Together, the QC and alignment checkpoints show that the retained 20-sample subset was technically stable enough for downstream modeling. With the preprocessing concerns resolved, the next question became whether the biological structure of the dataset was driven more strongly by injury side or by genotype.</w:t>
+        <w:t>Together, the QC and alignment checkpoints showed that the retained 20-sample subset was technically stable enough for downstream modeling. With the preprocessing concerns resolved, the next question became whether the biological structure of the dataset was driven more strongly by injury side or by genotype.</w:t>
       </w:r>
     </w:p>
     <w:p>
@@ -1768,7 +1726,7 @@
           <w:b w:val="0"/>
           <w:sz w:val="24"/>
         </w:rPr>
-        <w:t>The most stable finding in this dataset was that the side-specific injury contrasts carried the strongest structure. The early QC and alignment checkpoints supported keeping this 20-sample DRG subset for downstream modeling, but the main interpretive shift came from the PCA-first review: side separated more clearly than genotype, while genotype behaved as a secondary axis with substantial overlap between paired WT and cKO samples. The PCA and sample-distance views pointed to the same conclusion, making the side-specific contrasts the most defensible primary path for interpretation.</w:t>
+        <w:t>piterpara The most robust finding in this dataset was that side-specific injury contrasts carried the strongest signal. Early QC and alignment checkpoints supported retaining this 20-sample DRG subset for downstream modeling, but the main interpretive shift came from the PCA-first review: side separated more clearly than genotype, while genotype behaved as a secondary axis with substantial overlap between paired WT and cKO samples. The PCA and sample-distance views converged on the same conclusion, making side-specific contrasts the most defensible primary path for interpretation.</w:t>
       </w:r>
     </w:p>
     <w:p>
@@ -1782,7 +1740,7 @@
           <w:b w:val="0"/>
           <w:sz w:val="24"/>
         </w:rPr>
-        <w:t>This PCA-first reading disciplined the interpretation of the differential expression output. Rather than treating all modeled contrasts as equally informative, the workflow converged on a branch-priority logic in which ipsi_vs_contra_in_ff and ipsi_vs_contra_in_cre served as the main follow-up branches, while WT vs cKO in contralateral remained the strongest supporting genotype comparison. These secondary branches show that genotype effects are not absent, but they do not displace the side-specific injury signal as the dominant story.</w:t>
+        <w:t>This PCA-first reading disciplined the interpretation of the differential-expression output. Rather than treating all modeled contrasts as equally informative, the workflow converged on a branch-priority logic in which ipsi_vs_contra_in_ff and ipsi_vs_contra_in_cre served as the main follow-up branches, while WT vs cKO in contralateral remained the strongest supporting genotype comparison. These secondary branches indicate that genotype effects are present, but they do not displace the side-specific injury signal as the dominant story.</w:t>
       </w:r>
     </w:p>
     <w:p>
@@ -1796,7 +1754,7 @@
           <w:b w:val="0"/>
           <w:sz w:val="24"/>
         </w:rPr>
-        <w:t>The bend-point step marked the transition from broad differential expression output to a smaller and more interpretable follow-up set. For the two main side-specific contrasts, the ordered adjusted-p-value curve reduced 7,023 and 7,541 significant genes to 709 and 870 genes, respectively. These smaller sets remained strongly supported statistically while becoming practical for pathway-level analysis. In that sense, the bend-point step made the strongest part of the result easier to interpret against known injury and regeneration mechanisms.</w:t>
+        <w:t>The bend-point step marked the transition from broad differential-expression output to a smaller and more interpretable follow-up set. For the two main side-specific contrasts, the ordered adjusted-p-value curve reduced 7,023 and 7,541 significant genes to 709 and 870 genes, respectively. These smaller sets remained strongly supported statistically while becoming practical for pathway-level analysis. In that sense, the bend-point step made the most robust results easier to interpret against known injury and regeneration mechanisms.</w:t>
       </w:r>
     </w:p>
     <w:p>
@@ -1810,7 +1768,7 @@
           <w:b w:val="0"/>
           <w:sz w:val="24"/>
         </w:rPr>
-        <w:t>Among the follow-up branches, ipsi_vs_contra_in_ff remained the clearest pathway-level result. It combined a strong side-driven separation, a large but reducible differential expression set, and the most coherent enrichment profile. Once shared-gene structure was examined through the chart, tree, and network views, the strongest upregulated terms converged around signaling, migration, morphogenesis, stress response, and neurogenic remodeling. That convergence made the WT branch the strongest biological centerpiece for the discussion and extended the original paper's candidate-gene logic into a broader transcriptomic context (Halawani et al., 2023).</w:t>
+        <w:t>Among the follow-up branches, ipsi_vs_contra_in_ff remained the clearest pathway-level result. It combined a strong side-driven separation, a large but reducible differential-expression set, and the most coherent enrichment profile. Once shared-gene structure was examined through the chart, tree, and network views, the strongest upregulated terms converged around signaling, migration, morphogenesis, stress response, and neurogenic remodeling. That convergence made the WT branch the strongest biological centerpiece for the discussion and extended the original paper's candidate-gene logic into a broader transcriptomic context (Halawani et al., 2023).</w:t>
       </w:r>
     </w:p>
     <w:p>

</xml_diff>